<commit_message>
docs: update roadmap for v0.5.45 — known APK issues + keystore task
- Add "Известные проблемы (тестирование APK)" section: TTS fix, GPS fix
  (both resolved in v0.5.45), and pending persistent keystore for updates
- Add keystore task (#5) to sprint table for seamless APK updates
- Mark native TTS + background GPS as done
- Bump version references 0.5.43 → 0.5.45

Co-Authored-By: Claude Opus 4.6 <noreply@anthropic.com>
</commit_message>
<xml_diff>
--- a/Vector-Roadmap.docx
+++ b/Vector-Roadmap.docx
@@ -70,7 +70,7 @@
           <w:sz w:val="22"/>
           <w:szCs w:val="22"/>
         </w:rPr>
-        <w:t xml:space="preserve">Версия: 0.5.43  |  Май 2026</w:t>
+        <w:t xml:space="preserve">Версия: 0.5.45  |  Май 2026</w:t>
       </w:r>
     </w:p>
     <w:p>
@@ -922,7 +922,7 @@
         <w:rPr>
           <w:rFonts w:ascii="Arial" w:cs="Arial" w:eastAsia="Arial" w:hAnsi="Arial"/>
         </w:rPr>
-        <w:t xml:space="preserve">Текущее состояние (v0.5.43)</w:t>
+        <w:t xml:space="preserve">Текущее состояние (v0.5.45)</w:t>
       </w:r>
     </w:p>
     <w:p>
@@ -1357,6 +1357,108 @@
           <w:szCs w:val="22"/>
         </w:rPr>
         <w:t xml:space="preserve">Разработка ведётся через PWA (Vite HMR, горячая перезагрузка в браузере). Когда всё работает — Capacitor sync + Gradle build собирает APK для дистрибуции. Web-ассеты включаются внутрь APK (bundled mode), сервер не нужен.</w:t>
+      </w:r>
+    </w:p>
+    <w:p>
+      <w:pPr>
+        <w:pStyle w:val="Heading2"/>
+        <w:spacing w:after="120" w:before="240"/>
+      </w:pPr>
+      <w:r>
+        <w:rPr>
+          <w:rFonts w:ascii="Arial" w:cs="Arial" w:eastAsia="Arial" w:hAnsi="Arial"/>
+        </w:rPr>
+        <w:t xml:space="preserve">Известные проблемы (тестирование APK)</w:t>
+      </w:r>
+    </w:p>
+    <w:p>
+      <w:pPr>
+        <w:pStyle w:val="ListParagraph"/>
+        <w:numPr>
+          <w:ilvl w:val="0"/>
+          <w:numId w:val="3"/>
+        </w:numPr>
+        <w:spacing w:after="60"/>
+      </w:pPr>
+      <w:r>
+        <w:rPr>
+          <w:rFonts w:ascii="Arial" w:cs="Arial" w:eastAsia="Arial" w:hAnsi="Arial"/>
+          <w:b/>
+          <w:bCs/>
+          <w:color w:val="333333"/>
+          <w:sz w:val="22"/>
+          <w:szCs w:val="22"/>
+        </w:rPr>
+        <w:t xml:space="preserve">Голос в WebView. </w:t>
+      </w:r>
+      <w:r>
+        <w:rPr>
+          <w:rFonts w:ascii="Arial" w:cs="Arial" w:eastAsia="Arial" w:hAnsi="Arial"/>
+          <w:color w:val="333333"/>
+          <w:sz w:val="22"/>
+          <w:szCs w:val="22"/>
+        </w:rPr>
+        <w:t xml:space="preserve">РЕШЕНО (v0.5.45): Web Speech API не работает в Android WebView (баг Chromium #487255) → нативный TTS через @capacitor-community/text-to-speech.</w:t>
+      </w:r>
+    </w:p>
+    <w:p>
+      <w:pPr>
+        <w:pStyle w:val="ListParagraph"/>
+        <w:numPr>
+          <w:ilvl w:val="0"/>
+          <w:numId w:val="3"/>
+        </w:numPr>
+        <w:spacing w:after="60"/>
+      </w:pPr>
+      <w:r>
+        <w:rPr>
+          <w:rFonts w:ascii="Arial" w:cs="Arial" w:eastAsia="Arial" w:hAnsi="Arial"/>
+          <w:b/>
+          <w:bCs/>
+          <w:color w:val="333333"/>
+          <w:sz w:val="22"/>
+          <w:szCs w:val="22"/>
+        </w:rPr>
+        <w:t xml:space="preserve">GPS с выключенным экраном. </w:t>
+      </w:r>
+      <w:r>
+        <w:rPr>
+          <w:rFonts w:ascii="Arial" w:cs="Arial" w:eastAsia="Arial" w:hAnsi="Arial"/>
+          <w:color w:val="333333"/>
+          <w:sz w:val="22"/>
+          <w:szCs w:val="22"/>
+        </w:rPr>
+        <w:t xml:space="preserve">РЕШЕНО (v0.5.45): watchPosition троттлится через ~5 минут → нативный @capgo/background-geolocation + useLegacyBridge.</w:t>
+      </w:r>
+    </w:p>
+    <w:p>
+      <w:pPr>
+        <w:pStyle w:val="ListParagraph"/>
+        <w:numPr>
+          <w:ilvl w:val="0"/>
+          <w:numId w:val="3"/>
+        </w:numPr>
+        <w:spacing w:after="60"/>
+      </w:pPr>
+      <w:r>
+        <w:rPr>
+          <w:rFonts w:ascii="Arial" w:cs="Arial" w:eastAsia="Arial" w:hAnsi="Arial"/>
+          <w:b/>
+          <w:bCs/>
+          <w:color w:val="333333"/>
+          <w:sz w:val="22"/>
+          <w:szCs w:val="22"/>
+        </w:rPr>
+        <w:t xml:space="preserve">Обновление APK без удаления. </w:t>
+      </w:r>
+      <w:r>
+        <w:rPr>
+          <w:rFonts w:ascii="Arial" w:cs="Arial" w:eastAsia="Arial" w:hAnsi="Arial"/>
+          <w:color w:val="333333"/>
+          <w:sz w:val="22"/>
+          <w:szCs w:val="22"/>
+        </w:rPr>
+        <w:t xml:space="preserve">ОЖИДАЕТ: debug APK подписывается случайным ключом на каждой сборке CI → Android не даёт обновить поверх, требует удаления (теряются данные). Нужен фиксированный debug keystore в репозитории.</w:t>
       </w:r>
     </w:p>
     <w:p>
@@ -5418,7 +5520,7 @@
                 <w:sz w:val="20"/>
                 <w:szCs w:val="20"/>
               </w:rPr>
-              <w:t xml:space="preserve">Capacitor + foreground service + CI/CD</w:t>
+              <w:t xml:space="preserve">Capacitor + CI/CD (автосборка APK)</w:t>
             </w:r>
           </w:p>
         </w:tc>
@@ -5552,7 +5654,141 @@
                 <w:sz w:val="20"/>
                 <w:szCs w:val="20"/>
               </w:rPr>
-              <w:t xml:space="preserve">Полевые испытания APK (фоновый GPS, голос, экран выкл.)</w:t>
+              <w:t xml:space="preserve">Нативный TTS + фоновый GPS (плагины Capacitor)</w:t>
+            </w:r>
+          </w:p>
+        </w:tc>
+        <w:tc>
+          <w:tcPr>
+            <w:tcW w:type="dxa" w:w="2000"/>
+            <w:tcBorders>
+              <w:top w:val="single" w:color="CCCCCC" w:sz="1"/>
+              <w:left w:val="single" w:color="CCCCCC" w:sz="1"/>
+              <w:bottom w:val="single" w:color="CCCCCC" w:sz="1"/>
+              <w:right w:val="single" w:color="CCCCCC" w:sz="1"/>
+            </w:tcBorders>
+            <w:tcMar>
+              <w:top w:type="dxa" w:w="60"/>
+              <w:left w:type="dxa" w:w="100"/>
+              <w:bottom w:type="dxa" w:w="60"/>
+              <w:right w:type="dxa" w:w="100"/>
+            </w:tcMar>
+          </w:tcPr>
+          <w:p>
+            <w:pPr>
+              <w:jc w:val="left"/>
+            </w:pPr>
+            <w:r>
+              <w:rPr>
+                <w:rFonts w:ascii="Arial" w:cs="Arial" w:eastAsia="Arial" w:hAnsi="Arial"/>
+                <w:b/>
+                <w:bCs/>
+                <w:color w:val="1B5E20"/>
+                <w:sz w:val="20"/>
+                <w:szCs w:val="20"/>
+              </w:rPr>
+              <w:t xml:space="preserve">✅ Готово</w:t>
+            </w:r>
+          </w:p>
+        </w:tc>
+        <w:tc>
+          <w:tcPr>
+            <w:tcW w:type="dxa" w:w="2000"/>
+            <w:tcBorders>
+              <w:top w:val="single" w:color="CCCCCC" w:sz="1"/>
+              <w:left w:val="single" w:color="CCCCCC" w:sz="1"/>
+              <w:bottom w:val="single" w:color="CCCCCC" w:sz="1"/>
+              <w:right w:val="single" w:color="CCCCCC" w:sz="1"/>
+            </w:tcBorders>
+            <w:tcMar>
+              <w:top w:type="dxa" w:w="60"/>
+              <w:left w:type="dxa" w:w="100"/>
+              <w:bottom w:type="dxa" w:w="60"/>
+              <w:right w:type="dxa" w:w="100"/>
+            </w:tcMar>
+          </w:tcPr>
+          <w:p>
+            <w:pPr>
+              <w:jc w:val="center"/>
+            </w:pPr>
+            <w:r>
+              <w:rPr>
+                <w:rFonts w:ascii="Arial" w:cs="Arial" w:eastAsia="Arial" w:hAnsi="Arial"/>
+                <w:b w:val="false"/>
+                <w:bCs w:val="false"/>
+                <w:color w:val="0A0C0B"/>
+                <w:sz w:val="20"/>
+                <w:szCs w:val="20"/>
+              </w:rPr>
+              <w:t xml:space="preserve">P0</w:t>
+            </w:r>
+          </w:p>
+        </w:tc>
+      </w:tr>
+      <w:tr>
+        <w:tc>
+          <w:tcPr>
+            <w:tcW w:type="dxa" w:w="600"/>
+            <w:tcBorders>
+              <w:top w:val="single" w:color="CCCCCC" w:sz="1"/>
+              <w:left w:val="single" w:color="CCCCCC" w:sz="1"/>
+              <w:bottom w:val="single" w:color="CCCCCC" w:sz="1"/>
+              <w:right w:val="single" w:color="CCCCCC" w:sz="1"/>
+            </w:tcBorders>
+            <w:tcMar>
+              <w:top w:type="dxa" w:w="60"/>
+              <w:left w:type="dxa" w:w="100"/>
+              <w:bottom w:type="dxa" w:w="60"/>
+              <w:right w:type="dxa" w:w="100"/>
+            </w:tcMar>
+          </w:tcPr>
+          <w:p>
+            <w:pPr>
+              <w:jc w:val="center"/>
+            </w:pPr>
+            <w:r>
+              <w:rPr>
+                <w:rFonts w:ascii="Arial" w:cs="Arial" w:eastAsia="Arial" w:hAnsi="Arial"/>
+                <w:b w:val="false"/>
+                <w:bCs w:val="false"/>
+                <w:color w:val="0A0C0B"/>
+                <w:sz w:val="20"/>
+                <w:szCs w:val="20"/>
+              </w:rPr>
+              <w:t xml:space="preserve">3</w:t>
+            </w:r>
+          </w:p>
+        </w:tc>
+        <w:tc>
+          <w:tcPr>
+            <w:tcW w:type="dxa" w:w="4760"/>
+            <w:tcBorders>
+              <w:top w:val="single" w:color="CCCCCC" w:sz="1"/>
+              <w:left w:val="single" w:color="CCCCCC" w:sz="1"/>
+              <w:bottom w:val="single" w:color="CCCCCC" w:sz="1"/>
+              <w:right w:val="single" w:color="CCCCCC" w:sz="1"/>
+            </w:tcBorders>
+            <w:tcMar>
+              <w:top w:type="dxa" w:w="60"/>
+              <w:left w:type="dxa" w:w="100"/>
+              <w:bottom w:type="dxa" w:w="60"/>
+              <w:right w:type="dxa" w:w="100"/>
+            </w:tcMar>
+          </w:tcPr>
+          <w:p>
+            <w:pPr>
+              <w:jc w:val="left"/>
+            </w:pPr>
+            <w:r>
+              <w:rPr>
+                <w:rFonts w:ascii="Arial" w:cs="Arial" w:eastAsia="Arial" w:hAnsi="Arial"/>
+                <w:b w:val="false"/>
+                <w:bCs w:val="false"/>
+                <w:color w:val="0A0C0B"/>
+                <w:sz w:val="20"/>
+                <w:szCs w:val="20"/>
+              </w:rPr>
+              <w:t xml:space="preserve">Полевые испытания APK (голос, фоновый GPS, экран выкл.)</w:t>
             </w:r>
           </w:p>
         </w:tc>
@@ -5585,7 +5821,7 @@
                 <w:sz w:val="20"/>
                 <w:szCs w:val="20"/>
               </w:rPr>
-              <w:t xml:space="preserve">⏳ Следующий</w:t>
+              <w:t xml:space="preserve">⏳ Сейчас</w:t>
             </w:r>
           </w:p>
         </w:tc>
@@ -5653,7 +5889,7 @@
                 <w:sz w:val="20"/>
                 <w:szCs w:val="20"/>
               </w:rPr>
-              <w:t xml:space="preserve">3</w:t>
+              <w:t xml:space="preserve">4</w:t>
             </w:r>
           </w:p>
         </w:tc>
@@ -5686,7 +5922,7 @@
                 <w:sz w:val="20"/>
                 <w:szCs w:val="20"/>
               </w:rPr>
-              <w:t xml:space="preserve">Багфиксы по результатам испытаний</w:t>
+              <w:t xml:space="preserve">Багфиксы по результатам испытаний APK</w:t>
             </w:r>
           </w:p>
         </w:tc>
@@ -5787,7 +6023,7 @@
                 <w:sz w:val="20"/>
                 <w:szCs w:val="20"/>
               </w:rPr>
-              <w:t xml:space="preserve">4</w:t>
+              <w:t xml:space="preserve">5</w:t>
             </w:r>
           </w:p>
         </w:tc>
@@ -5820,7 +6056,7 @@
                 <w:sz w:val="20"/>
                 <w:szCs w:val="20"/>
               </w:rPr>
-              <w:t xml:space="preserve">i18n: перевод UI на EN</w:t>
+              <w:t xml:space="preserve">Фиксированный debug keystore — обновление APK без удаления (сохранение данных)</w:t>
             </w:r>
           </w:p>
         </w:tc>
@@ -5921,7 +6157,7 @@
                 <w:sz w:val="20"/>
                 <w:szCs w:val="20"/>
               </w:rPr>
-              <w:t xml:space="preserve">5</w:t>
+              <w:t xml:space="preserve">6</w:t>
             </w:r>
           </w:p>
         </w:tc>
@@ -5954,7 +6190,7 @@
                 <w:sz w:val="20"/>
                 <w:szCs w:val="20"/>
               </w:rPr>
-              <w:t xml:space="preserve">Privacy Policy + Terms of Service</w:t>
+              <w:t xml:space="preserve">i18n: перевод UI на EN</w:t>
             </w:r>
           </w:p>
         </w:tc>
@@ -6055,7 +6291,7 @@
                 <w:sz w:val="20"/>
                 <w:szCs w:val="20"/>
               </w:rPr>
-              <w:t xml:space="preserve">6</w:t>
+              <w:t xml:space="preserve">7</w:t>
             </w:r>
           </w:p>
         </w:tc>
@@ -6088,7 +6324,7 @@
                 <w:sz w:val="20"/>
                 <w:szCs w:val="20"/>
               </w:rPr>
-              <w:t xml:space="preserve">Google Play Developer Account + листинг</w:t>
+              <w:t xml:space="preserve">Privacy Policy + Terms of Service</w:t>
             </w:r>
           </w:p>
         </w:tc>
@@ -6189,7 +6425,7 @@
                 <w:sz w:val="20"/>
                 <w:szCs w:val="20"/>
               </w:rPr>
-              <w:t xml:space="preserve">7</w:t>
+              <w:t xml:space="preserve">8</w:t>
             </w:r>
           </w:p>
         </w:tc>
@@ -6222,7 +6458,7 @@
                 <w:sz w:val="20"/>
                 <w:szCs w:val="20"/>
               </w:rPr>
-              <w:t xml:space="preserve">Рефакторинг RideScreen + GPS provider</w:t>
+              <w:t xml:space="preserve">Google Play Developer Account + листинг</w:t>
             </w:r>
           </w:p>
         </w:tc>
@@ -6288,7 +6524,7 @@
                 <w:sz w:val="20"/>
                 <w:szCs w:val="20"/>
               </w:rPr>
-              <w:t xml:space="preserve">P2</w:t>
+              <w:t xml:space="preserve">P1</w:t>
             </w:r>
           </w:p>
         </w:tc>
@@ -6323,7 +6559,141 @@
                 <w:sz w:val="20"/>
                 <w:szCs w:val="20"/>
               </w:rPr>
-              <w:t xml:space="preserve">8</w:t>
+              <w:t xml:space="preserve">9</w:t>
+            </w:r>
+          </w:p>
+        </w:tc>
+        <w:tc>
+          <w:tcPr>
+            <w:tcW w:type="dxa" w:w="4760"/>
+            <w:tcBorders>
+              <w:top w:val="single" w:color="CCCCCC" w:sz="1"/>
+              <w:left w:val="single" w:color="CCCCCC" w:sz="1"/>
+              <w:bottom w:val="single" w:color="CCCCCC" w:sz="1"/>
+              <w:right w:val="single" w:color="CCCCCC" w:sz="1"/>
+            </w:tcBorders>
+            <w:tcMar>
+              <w:top w:type="dxa" w:w="60"/>
+              <w:left w:type="dxa" w:w="100"/>
+              <w:bottom w:type="dxa" w:w="60"/>
+              <w:right w:type="dxa" w:w="100"/>
+            </w:tcMar>
+          </w:tcPr>
+          <w:p>
+            <w:pPr>
+              <w:jc w:val="left"/>
+            </w:pPr>
+            <w:r>
+              <w:rPr>
+                <w:rFonts w:ascii="Arial" w:cs="Arial" w:eastAsia="Arial" w:hAnsi="Arial"/>
+                <w:b w:val="false"/>
+                <w:bCs w:val="false"/>
+                <w:color w:val="0A0C0B"/>
+                <w:sz w:val="20"/>
+                <w:szCs w:val="20"/>
+              </w:rPr>
+              <w:t xml:space="preserve">Рефакторинг RideScreen + единый GPS provider</w:t>
+            </w:r>
+          </w:p>
+        </w:tc>
+        <w:tc>
+          <w:tcPr>
+            <w:tcW w:type="dxa" w:w="2000"/>
+            <w:tcBorders>
+              <w:top w:val="single" w:color="CCCCCC" w:sz="1"/>
+              <w:left w:val="single" w:color="CCCCCC" w:sz="1"/>
+              <w:bottom w:val="single" w:color="CCCCCC" w:sz="1"/>
+              <w:right w:val="single" w:color="CCCCCC" w:sz="1"/>
+            </w:tcBorders>
+            <w:tcMar>
+              <w:top w:type="dxa" w:w="60"/>
+              <w:left w:type="dxa" w:w="100"/>
+              <w:bottom w:type="dxa" w:w="60"/>
+              <w:right w:type="dxa" w:w="100"/>
+            </w:tcMar>
+          </w:tcPr>
+          <w:p>
+            <w:pPr>
+              <w:jc w:val="left"/>
+            </w:pPr>
+            <w:r>
+              <w:rPr>
+                <w:rFonts w:ascii="Arial" w:cs="Arial" w:eastAsia="Arial" w:hAnsi="Arial"/>
+                <w:b w:val="false"/>
+                <w:bCs w:val="false"/>
+                <w:color w:val="757575"/>
+                <w:sz w:val="20"/>
+                <w:szCs w:val="20"/>
+              </w:rPr>
+              <w:t xml:space="preserve">⏳ Ожидает</w:t>
+            </w:r>
+          </w:p>
+        </w:tc>
+        <w:tc>
+          <w:tcPr>
+            <w:tcW w:type="dxa" w:w="2000"/>
+            <w:tcBorders>
+              <w:top w:val="single" w:color="CCCCCC" w:sz="1"/>
+              <w:left w:val="single" w:color="CCCCCC" w:sz="1"/>
+              <w:bottom w:val="single" w:color="CCCCCC" w:sz="1"/>
+              <w:right w:val="single" w:color="CCCCCC" w:sz="1"/>
+            </w:tcBorders>
+            <w:tcMar>
+              <w:top w:type="dxa" w:w="60"/>
+              <w:left w:type="dxa" w:w="100"/>
+              <w:bottom w:type="dxa" w:w="60"/>
+              <w:right w:type="dxa" w:w="100"/>
+            </w:tcMar>
+          </w:tcPr>
+          <w:p>
+            <w:pPr>
+              <w:jc w:val="center"/>
+            </w:pPr>
+            <w:r>
+              <w:rPr>
+                <w:rFonts w:ascii="Arial" w:cs="Arial" w:eastAsia="Arial" w:hAnsi="Arial"/>
+                <w:b w:val="false"/>
+                <w:bCs w:val="false"/>
+                <w:color w:val="0A0C0B"/>
+                <w:sz w:val="20"/>
+                <w:szCs w:val="20"/>
+              </w:rPr>
+              <w:t xml:space="preserve">P2</w:t>
+            </w:r>
+          </w:p>
+        </w:tc>
+      </w:tr>
+      <w:tr>
+        <w:tc>
+          <w:tcPr>
+            <w:tcW w:type="dxa" w:w="600"/>
+            <w:tcBorders>
+              <w:top w:val="single" w:color="CCCCCC" w:sz="1"/>
+              <w:left w:val="single" w:color="CCCCCC" w:sz="1"/>
+              <w:bottom w:val="single" w:color="CCCCCC" w:sz="1"/>
+              <w:right w:val="single" w:color="CCCCCC" w:sz="1"/>
+            </w:tcBorders>
+            <w:tcMar>
+              <w:top w:type="dxa" w:w="60"/>
+              <w:left w:type="dxa" w:w="100"/>
+              <w:bottom w:type="dxa" w:w="60"/>
+              <w:right w:type="dxa" w:w="100"/>
+            </w:tcMar>
+          </w:tcPr>
+          <w:p>
+            <w:pPr>
+              <w:jc w:val="center"/>
+            </w:pPr>
+            <w:r>
+              <w:rPr>
+                <w:rFonts w:ascii="Arial" w:cs="Arial" w:eastAsia="Arial" w:hAnsi="Arial"/>
+                <w:b w:val="false"/>
+                <w:bCs w:val="false"/>
+                <w:color w:val="0A0C0B"/>
+                <w:sz w:val="20"/>
+                <w:szCs w:val="20"/>
+              </w:rPr>
+              <w:t xml:space="preserve">10</w:t>
             </w:r>
           </w:p>
         </w:tc>
@@ -6517,7 +6887,7 @@
         <w:sz w:val="16"/>
         <w:szCs w:val="16"/>
       </w:rPr>
-      <w:t xml:space="preserve">v0.5.43 | Май 2026 | </w:t>
+      <w:t xml:space="preserve">v0.5.45 | Май 2026 | </w:t>
     </w:r>
     <w:r>
       <w:rPr>

</xml_diff>